<commit_message>
1ª versão: os convites para cotar recebidos ficam no Measure Takeoff (aba Convites, faixa no projeto, avisos) e entram no guia
Co-Authored-By: Claude Sonnet 5.5 <noreply@anthropic.com>
Claude-Session: https://claude.ai/code/session_01Ep8bJsuQq2bqGePCMzzux2
</commit_message>
<xml_diff>
--- a/portal-measure/files/KORbuild Measure Takeoff - User manual.docx
+++ b/portal-measure/files/KORbuild Measure Takeoff - User manual.docx
@@ -4472,6 +4472,205 @@
           <w:i/>
         </w:rPr>
         <w:t>Editing an assembly: formula, waste, rounding and the live test</w:t>
+      </w:r>
+    </w:p>
+    <w:p>
+      <w:pPr>
+        <w:pStyle w:val="Heading1"/>
+      </w:pPr>
+      <w:r>
+        <w:rPr>
+          <w:b w:val="0"/>
+          <w:i w:val="0"/>
+        </w:rPr>
+        <w:t>Invitations to bid you receive</w:t>
+      </w:r>
+    </w:p>
+    <w:p>
+      <w:r>
+        <w:rPr>
+          <w:b/>
+          <w:i w:val="0"/>
+        </w:rPr>
+        <w:t>What it is for:</w:t>
+      </w:r>
+      <w:r>
+        <w:rPr>
+          <w:b w:val="0"/>
+          <w:i w:val="0"/>
+        </w:rPr>
+        <w:t xml:space="preserve"> when a general contractor (or another company) invites yours to bid through KORbuild, the invitation arrives in Measure Takeoff and you answer it there.</w:t>
+      </w:r>
+    </w:p>
+    <w:p>
+      <w:pPr>
+        <w:pStyle w:val="ListNumber"/>
+        <w:numPr>
+          <w:ilvl w:val="0"/>
+          <w:numId w:val="17"/>
+        </w:numPr>
+      </w:pPr>
+      <w:r>
+        <w:rPr>
+          <w:b w:val="0"/>
+          <w:i w:val="0"/>
+        </w:rPr>
+        <w:t xml:space="preserve">Open </w:t>
+      </w:r>
+      <w:r>
+        <w:rPr>
+          <w:b/>
+          <w:i w:val="0"/>
+        </w:rPr>
+        <w:t>Invitations</w:t>
+      </w:r>
+      <w:r>
+        <w:rPr>
+          <w:b w:val="0"/>
+          <w:i w:val="0"/>
+        </w:rPr>
+        <w:t xml:space="preserve"> in the Measure Takeoff menu. The bell also warns you when a new invitation arrives.</w:t>
+      </w:r>
+    </w:p>
+    <w:p>
+      <w:pPr>
+        <w:pStyle w:val="ListNumber"/>
+        <w:numPr>
+          <w:ilvl w:val="0"/>
+          <w:numId w:val="17"/>
+        </w:numPr>
+      </w:pPr>
+      <w:r>
+        <w:rPr>
+          <w:b w:val="0"/>
+          <w:i w:val="0"/>
+        </w:rPr>
+        <w:t xml:space="preserve">Open the invitation: the package (cost codes, drawings, due date, requirements) and the history. Use </w:t>
+      </w:r>
+      <w:r>
+        <w:rPr>
+          <w:b/>
+          <w:i w:val="0"/>
+        </w:rPr>
+        <w:t>Questions and messages</w:t>
+      </w:r>
+      <w:r>
+        <w:rPr>
+          <w:b w:val="0"/>
+          <w:i w:val="0"/>
+        </w:rPr>
+        <w:t xml:space="preserve"> to ask the contractor before the due date.</w:t>
+      </w:r>
+    </w:p>
+    <w:p>
+      <w:pPr>
+        <w:pStyle w:val="ListNumber"/>
+        <w:numPr>
+          <w:ilvl w:val="0"/>
+          <w:numId w:val="17"/>
+        </w:numPr>
+      </w:pPr>
+      <w:r>
+        <w:rPr>
+          <w:b w:val="0"/>
+          <w:i w:val="0"/>
+        </w:rPr>
+        <w:t xml:space="preserve">Click </w:t>
+      </w:r>
+      <w:r>
+        <w:rPr>
+          <w:b/>
+          <w:i w:val="0"/>
+        </w:rPr>
+        <w:t>I'll bid</w:t>
+      </w:r>
+      <w:r>
+        <w:rPr>
+          <w:b w:val="0"/>
+          <w:i w:val="0"/>
+        </w:rPr>
+        <w:t xml:space="preserve"> or </w:t>
+      </w:r>
+      <w:r>
+        <w:rPr>
+          <w:b/>
+          <w:i w:val="0"/>
+        </w:rPr>
+        <w:t>Decline</w:t>
+      </w:r>
+      <w:r>
+        <w:rPr>
+          <w:b w:val="0"/>
+          <w:i w:val="0"/>
+        </w:rPr>
+        <w:t xml:space="preserve"> (with an optional reason the contractor sees).</w:t>
+      </w:r>
+    </w:p>
+    <w:p>
+      <w:pPr>
+        <w:pStyle w:val="ListNumber"/>
+        <w:numPr>
+          <w:ilvl w:val="0"/>
+          <w:numId w:val="17"/>
+        </w:numPr>
+      </w:pPr>
+      <w:r>
+        <w:rPr>
+          <w:b/>
+          <w:i w:val="0"/>
+        </w:rPr>
+        <w:t>I'll bid</w:t>
+      </w:r>
+      <w:r>
+        <w:rPr>
+          <w:b w:val="0"/>
+          <w:i w:val="0"/>
+        </w:rPr>
+        <w:t xml:space="preserve"> creates a project in Measure Takeoff with the drawings already attached. Measure, build the proposal and issue it.</w:t>
+      </w:r>
+    </w:p>
+    <w:p>
+      <w:pPr>
+        <w:pStyle w:val="ListNumber"/>
+        <w:numPr>
+          <w:ilvl w:val="0"/>
+          <w:numId w:val="17"/>
+        </w:numPr>
+      </w:pPr>
+      <w:r>
+        <w:rPr>
+          <w:b w:val="0"/>
+          <w:i w:val="0"/>
+        </w:rPr>
+        <w:t xml:space="preserve">In </w:t>
+      </w:r>
+      <w:r>
+        <w:rPr>
+          <w:b/>
+          <w:i w:val="0"/>
+        </w:rPr>
+        <w:t>Issued proposals</w:t>
+      </w:r>
+      <w:r>
+        <w:rPr>
+          <w:b w:val="0"/>
+          <w:i w:val="0"/>
+        </w:rPr>
+        <w:t xml:space="preserve">, click </w:t>
+      </w:r>
+      <w:r>
+        <w:rPr>
+          <w:b/>
+          <w:i w:val="0"/>
+        </w:rPr>
+        <w:t>Submit through the platform</w:t>
+      </w:r>
+      <w:r>
+        <w:rPr>
+          <w:b w:val="0"/>
+          <w:i w:val="0"/>
+        </w:rPr>
+        <w:t>: fill in the duration and the exclusions and submit. To change anything, issue again and submit; it becomes the next revision, until the due date.</w:t>
       </w:r>
     </w:p>
     <w:p>
@@ -5191,6 +5390,12 @@
       <w:startOverride w:val="1"/>
     </w:lvlOverride>
   </w:num>
+  <w:num w:numId="17">
+    <w:abstractNumId w:val="7"/>
+    <w:lvlOverride w:ilvl="0">
+      <w:startOverride w:val="1"/>
+    </w:lvlOverride>
+  </w:num>
 </w:numbering>
 </file>
 

</xml_diff>